<commit_message>
Fix docx: heading 4 now black and make authors one line
</commit_message>
<xml_diff>
--- a/inst/templates/reference.docx
+++ b/inst/templates/reference.docx
@@ -1,6 +1,6 @@
 
 <file path=word/document.xml><?xml version="1.0" encoding="utf-8"?>
-<w:document xmlns:wpc="http://schemas.microsoft.com/office/word/2010/wordprocessingCanvas" xmlns:cx="http://schemas.microsoft.com/office/drawing/2014/chartex" xmlns:cx1="http://schemas.microsoft.com/office/drawing/2015/9/8/chartex" xmlns:cx2="http://schemas.microsoft.com/office/drawing/2015/10/21/chartex" xmlns:cx3="http://schemas.microsoft.com/office/drawing/2016/5/9/chartex" xmlns:cx4="http://schemas.microsoft.com/office/drawing/2016/5/10/chartex" xmlns:cx5="http://schemas.microsoft.com/office/drawing/2016/5/11/chartex" xmlns:cx6="http://schemas.microsoft.com/office/drawing/2016/5/12/chartex" xmlns:cx7="http://schemas.microsoft.com/office/drawing/2016/5/13/chartex" xmlns:cx8="http://schemas.microsoft.com/office/drawing/2016/5/14/chartex" xmlns:mc="http://schemas.openxmlformats.org/markup-compatibility/2006" xmlns:aink="http://schemas.microsoft.com/office/drawing/2016/ink" xmlns:am3d="http://schemas.microsoft.com/office/drawing/2017/model3d" xmlns:o="urn:schemas-microsoft-com:office:office" xmlns:oel="http://schemas.microsoft.com/office/2019/extlst" xmlns:r="http://schemas.openxmlformats.org/officeDocument/2006/relationships" xmlns:m="http://schemas.openxmlformats.org/officeDocument/2006/math" xmlns:v="urn:schemas-microsoft-com:vml" xmlns:wp14="http://schemas.microsoft.com/office/word/2010/wordprocessingDrawing" xmlns:wp="http://schemas.openxmlformats.org/drawingml/2006/wordprocessingDrawing" xmlns:w10="urn:schemas-microsoft-com:office:word" xmlns:w="http://schemas.openxmlformats.org/wordprocessingml/2006/main" xmlns:w14="http://schemas.microsoft.com/office/word/2010/wordml" xmlns:w15="http://schemas.microsoft.com/office/word/2012/wordml" xmlns:w16cex="http://schemas.microsoft.com/office/word/2018/wordml/cex" xmlns:w16cid="http://schemas.microsoft.com/office/word/2016/wordml/cid" xmlns:w16="http://schemas.microsoft.com/office/word/2018/wordml" xmlns:w16du="http://schemas.microsoft.com/office/word/2023/wordml/word16du" xmlns:w16sdtdh="http://schemas.microsoft.com/office/word/2020/wordml/sdtdatahash" xmlns:w16sdtfl="http://schemas.microsoft.com/office/word/2024/wordml/sdtformatlock" xmlns:w16se="http://schemas.microsoft.com/office/word/2015/wordml/symex" xmlns:wpg="http://schemas.microsoft.com/office/word/2010/wordprocessingGroup" xmlns:wpi="http://schemas.microsoft.com/office/word/2010/wordprocessingInk" xmlns:wne="http://schemas.microsoft.com/office/word/2006/wordml" xmlns:wps="http://schemas.microsoft.com/office/word/2010/wordprocessingShape" mc:Ignorable="w14 w15 w16se w16cid w16 w16cex w16sdtdh w16sdtfl w16du wp14">
+<w:document xmlns:wpc="http://schemas.microsoft.com/office/word/2010/wordprocessingCanvas" xmlns:cx="http://schemas.microsoft.com/office/drawing/2014/chartex" xmlns:cx1="http://schemas.microsoft.com/office/drawing/2015/9/8/chartex" xmlns:cx2="http://schemas.microsoft.com/office/drawing/2015/10/21/chartex" xmlns:cx3="http://schemas.microsoft.com/office/drawing/2016/5/9/chartex" xmlns:cx4="http://schemas.microsoft.com/office/drawing/2016/5/10/chartex" xmlns:cx5="http://schemas.microsoft.com/office/drawing/2016/5/11/chartex" xmlns:cx6="http://schemas.microsoft.com/office/drawing/2016/5/12/chartex" xmlns:cx7="http://schemas.microsoft.com/office/drawing/2016/5/13/chartex" xmlns:cx8="http://schemas.microsoft.com/office/drawing/2016/5/14/chartex" xmlns:mc="http://schemas.openxmlformats.org/markup-compatibility/2006" xmlns:m="http://schemas.openxmlformats.org/officeDocument/2006/math" xmlns:aink="http://schemas.microsoft.com/office/drawing/2016/ink" xmlns:am3d="http://schemas.microsoft.com/office/drawing/2017/model3d" xmlns:oel="http://schemas.microsoft.com/office/2019/extlst" xmlns:r="http://schemas.openxmlformats.org/officeDocument/2006/relationships" xmlns:wp14="http://schemas.microsoft.com/office/word/2010/wordprocessingDrawing" xmlns:wp="http://schemas.openxmlformats.org/drawingml/2006/wordprocessingDrawing" xmlns:wpg="http://schemas.microsoft.com/office/word/2010/wordprocessingGroup" xmlns:wpi="http://schemas.microsoft.com/office/word/2010/wordprocessingInk" xmlns:wps="http://schemas.microsoft.com/office/word/2010/wordprocessingShape" xmlns:o="urn:schemas-microsoft-com:office:office" xmlns:v="urn:schemas-microsoft-com:vml" xmlns:w10="urn:schemas-microsoft-com:office:word" xmlns:w="http://schemas.openxmlformats.org/wordprocessingml/2006/main" xmlns:w14="http://schemas.microsoft.com/office/word/2010/wordml" xmlns:w15="http://schemas.microsoft.com/office/word/2012/wordml" xmlns:w16cex="http://schemas.microsoft.com/office/word/2018/wordml/cex" xmlns:w16cid="http://schemas.microsoft.com/office/word/2016/wordml/cid" xmlns:w16="http://schemas.microsoft.com/office/word/2018/wordml" xmlns:w16sdtdh="http://schemas.microsoft.com/office/word/2020/wordml/sdtdatahash" xmlns:w16sdtfl="http://schemas.microsoft.com/office/word/2024/wordml/sdtformatlock" xmlns:w16se="http://schemas.microsoft.com/office/word/2015/wordml/symex" xmlns:w16du="http://schemas.microsoft.com/office/word/2023/wordml/word16du" xmlns:wne="http://schemas.microsoft.com/office/word/2006/wordml" mc:Ignorable="w14 w15 w16se w16cid w16 w16cex w16sdtdh w16sdtfl w16du wp14">
   <w:body>
     <w:p>
       <w:pPr>
@@ -160,10 +160,7 @@
     </w:p>
     <w:p>
       <w:r>
-        <w:t>Normal text</w:t>
-      </w:r>
-      <w:r>
-        <w:t>.</w:t>
+        <w:t>Normal text.</w:t>
       </w:r>
     </w:p>
     <w:p>
@@ -342,7 +339,7 @@
 </file>
 
 <file path=word/endnotes.xml><?xml version="1.0" encoding="utf-8"?>
-<w:endnotes xmlns:wpc="http://schemas.microsoft.com/office/word/2010/wordprocessingCanvas" xmlns:cx="http://schemas.microsoft.com/office/drawing/2014/chartex" xmlns:cx1="http://schemas.microsoft.com/office/drawing/2015/9/8/chartex" xmlns:cx2="http://schemas.microsoft.com/office/drawing/2015/10/21/chartex" xmlns:cx3="http://schemas.microsoft.com/office/drawing/2016/5/9/chartex" xmlns:cx4="http://schemas.microsoft.com/office/drawing/2016/5/10/chartex" xmlns:cx5="http://schemas.microsoft.com/office/drawing/2016/5/11/chartex" xmlns:cx6="http://schemas.microsoft.com/office/drawing/2016/5/12/chartex" xmlns:cx7="http://schemas.microsoft.com/office/drawing/2016/5/13/chartex" xmlns:cx8="http://schemas.microsoft.com/office/drawing/2016/5/14/chartex" xmlns:mc="http://schemas.openxmlformats.org/markup-compatibility/2006" xmlns:aink="http://schemas.microsoft.com/office/drawing/2016/ink" xmlns:am3d="http://schemas.microsoft.com/office/drawing/2017/model3d" xmlns:o="urn:schemas-microsoft-com:office:office" xmlns:oel="http://schemas.microsoft.com/office/2019/extlst" xmlns:r="http://schemas.openxmlformats.org/officeDocument/2006/relationships" xmlns:m="http://schemas.openxmlformats.org/officeDocument/2006/math" xmlns:v="urn:schemas-microsoft-com:vml" xmlns:wp14="http://schemas.microsoft.com/office/word/2010/wordprocessingDrawing" xmlns:wp="http://schemas.openxmlformats.org/drawingml/2006/wordprocessingDrawing" xmlns:w10="urn:schemas-microsoft-com:office:word" xmlns:w="http://schemas.openxmlformats.org/wordprocessingml/2006/main" xmlns:w14="http://schemas.microsoft.com/office/word/2010/wordml" xmlns:w15="http://schemas.microsoft.com/office/word/2012/wordml" xmlns:w16cex="http://schemas.microsoft.com/office/word/2018/wordml/cex" xmlns:w16cid="http://schemas.microsoft.com/office/word/2016/wordml/cid" xmlns:w16="http://schemas.microsoft.com/office/word/2018/wordml" xmlns:w16du="http://schemas.microsoft.com/office/word/2023/wordml/word16du" xmlns:w16sdtdh="http://schemas.microsoft.com/office/word/2020/wordml/sdtdatahash" xmlns:w16sdtfl="http://schemas.microsoft.com/office/word/2024/wordml/sdtformatlock" xmlns:w16se="http://schemas.microsoft.com/office/word/2015/wordml/symex" xmlns:wpg="http://schemas.microsoft.com/office/word/2010/wordprocessingGroup" xmlns:wpi="http://schemas.microsoft.com/office/word/2010/wordprocessingInk" xmlns:wne="http://schemas.microsoft.com/office/word/2006/wordml" xmlns:wps="http://schemas.microsoft.com/office/word/2010/wordprocessingShape" mc:Ignorable="w14 w15 w16se w16cid w16 w16cex w16sdtdh w16sdtfl w16du wp14">
+<w:endnotes xmlns:wpc="http://schemas.microsoft.com/office/word/2010/wordprocessingCanvas" xmlns:cx="http://schemas.microsoft.com/office/drawing/2014/chartex" xmlns:cx1="http://schemas.microsoft.com/office/drawing/2015/9/8/chartex" xmlns:cx2="http://schemas.microsoft.com/office/drawing/2015/10/21/chartex" xmlns:cx3="http://schemas.microsoft.com/office/drawing/2016/5/9/chartex" xmlns:cx4="http://schemas.microsoft.com/office/drawing/2016/5/10/chartex" xmlns:cx5="http://schemas.microsoft.com/office/drawing/2016/5/11/chartex" xmlns:cx6="http://schemas.microsoft.com/office/drawing/2016/5/12/chartex" xmlns:cx7="http://schemas.microsoft.com/office/drawing/2016/5/13/chartex" xmlns:cx8="http://schemas.microsoft.com/office/drawing/2016/5/14/chartex" xmlns:mc="http://schemas.openxmlformats.org/markup-compatibility/2006" xmlns:m="http://schemas.openxmlformats.org/officeDocument/2006/math" xmlns:aink="http://schemas.microsoft.com/office/drawing/2016/ink" xmlns:am3d="http://schemas.microsoft.com/office/drawing/2017/model3d" xmlns:oel="http://schemas.microsoft.com/office/2019/extlst" xmlns:r="http://schemas.openxmlformats.org/officeDocument/2006/relationships" xmlns:wp14="http://schemas.microsoft.com/office/word/2010/wordprocessingDrawing" xmlns:wp="http://schemas.openxmlformats.org/drawingml/2006/wordprocessingDrawing" xmlns:wpg="http://schemas.microsoft.com/office/word/2010/wordprocessingGroup" xmlns:wpi="http://schemas.microsoft.com/office/word/2010/wordprocessingInk" xmlns:wps="http://schemas.microsoft.com/office/word/2010/wordprocessingShape" xmlns:o="urn:schemas-microsoft-com:office:office" xmlns:v="urn:schemas-microsoft-com:vml" xmlns:w10="urn:schemas-microsoft-com:office:word" xmlns:w="http://schemas.openxmlformats.org/wordprocessingml/2006/main" xmlns:w14="http://schemas.microsoft.com/office/word/2010/wordml" xmlns:w15="http://schemas.microsoft.com/office/word/2012/wordml" xmlns:w16cex="http://schemas.microsoft.com/office/word/2018/wordml/cex" xmlns:w16cid="http://schemas.microsoft.com/office/word/2016/wordml/cid" xmlns:w16="http://schemas.microsoft.com/office/word/2018/wordml" xmlns:w16sdtdh="http://schemas.microsoft.com/office/word/2020/wordml/sdtdatahash" xmlns:w16sdtfl="http://schemas.microsoft.com/office/word/2024/wordml/sdtformatlock" xmlns:w16se="http://schemas.microsoft.com/office/word/2015/wordml/symex" xmlns:w16du="http://schemas.microsoft.com/office/word/2023/wordml/word16du" xmlns:wne="http://schemas.microsoft.com/office/word/2006/wordml" mc:Ignorable="w14 w15 w16se w16cid w16 w16cex w16sdtdh w16sdtfl w16du wp14">
   <w:endnote w:type="separator" w:id="-1">
     <w:p>
       <w:pPr>
@@ -367,7 +364,7 @@
 </file>
 
 <file path=word/footnotes.xml><?xml version="1.0" encoding="utf-8"?>
-<w:footnotes xmlns:wpc="http://schemas.microsoft.com/office/word/2010/wordprocessingCanvas" xmlns:cx="http://schemas.microsoft.com/office/drawing/2014/chartex" xmlns:cx1="http://schemas.microsoft.com/office/drawing/2015/9/8/chartex" xmlns:cx2="http://schemas.microsoft.com/office/drawing/2015/10/21/chartex" xmlns:cx3="http://schemas.microsoft.com/office/drawing/2016/5/9/chartex" xmlns:cx4="http://schemas.microsoft.com/office/drawing/2016/5/10/chartex" xmlns:cx5="http://schemas.microsoft.com/office/drawing/2016/5/11/chartex" xmlns:cx6="http://schemas.microsoft.com/office/drawing/2016/5/12/chartex" xmlns:cx7="http://schemas.microsoft.com/office/drawing/2016/5/13/chartex" xmlns:cx8="http://schemas.microsoft.com/office/drawing/2016/5/14/chartex" xmlns:mc="http://schemas.openxmlformats.org/markup-compatibility/2006" xmlns:aink="http://schemas.microsoft.com/office/drawing/2016/ink" xmlns:am3d="http://schemas.microsoft.com/office/drawing/2017/model3d" xmlns:o="urn:schemas-microsoft-com:office:office" xmlns:oel="http://schemas.microsoft.com/office/2019/extlst" xmlns:r="http://schemas.openxmlformats.org/officeDocument/2006/relationships" xmlns:m="http://schemas.openxmlformats.org/officeDocument/2006/math" xmlns:v="urn:schemas-microsoft-com:vml" xmlns:wp14="http://schemas.microsoft.com/office/word/2010/wordprocessingDrawing" xmlns:wp="http://schemas.openxmlformats.org/drawingml/2006/wordprocessingDrawing" xmlns:w10="urn:schemas-microsoft-com:office:word" xmlns:w="http://schemas.openxmlformats.org/wordprocessingml/2006/main" xmlns:w14="http://schemas.microsoft.com/office/word/2010/wordml" xmlns:w15="http://schemas.microsoft.com/office/word/2012/wordml" xmlns:w16cex="http://schemas.microsoft.com/office/word/2018/wordml/cex" xmlns:w16cid="http://schemas.microsoft.com/office/word/2016/wordml/cid" xmlns:w16="http://schemas.microsoft.com/office/word/2018/wordml" xmlns:w16du="http://schemas.microsoft.com/office/word/2023/wordml/word16du" xmlns:w16sdtdh="http://schemas.microsoft.com/office/word/2020/wordml/sdtdatahash" xmlns:w16sdtfl="http://schemas.microsoft.com/office/word/2024/wordml/sdtformatlock" xmlns:w16se="http://schemas.microsoft.com/office/word/2015/wordml/symex" xmlns:wpg="http://schemas.microsoft.com/office/word/2010/wordprocessingGroup" xmlns:wpi="http://schemas.microsoft.com/office/word/2010/wordprocessingInk" xmlns:wne="http://schemas.microsoft.com/office/word/2006/wordml" xmlns:wps="http://schemas.microsoft.com/office/word/2010/wordprocessingShape" mc:Ignorable="w14 w15 w16se w16cid w16 w16cex w16sdtdh w16sdtfl w16du wp14">
+<w:footnotes xmlns:wpc="http://schemas.microsoft.com/office/word/2010/wordprocessingCanvas" xmlns:cx="http://schemas.microsoft.com/office/drawing/2014/chartex" xmlns:cx1="http://schemas.microsoft.com/office/drawing/2015/9/8/chartex" xmlns:cx2="http://schemas.microsoft.com/office/drawing/2015/10/21/chartex" xmlns:cx3="http://schemas.microsoft.com/office/drawing/2016/5/9/chartex" xmlns:cx4="http://schemas.microsoft.com/office/drawing/2016/5/10/chartex" xmlns:cx5="http://schemas.microsoft.com/office/drawing/2016/5/11/chartex" xmlns:cx6="http://schemas.microsoft.com/office/drawing/2016/5/12/chartex" xmlns:cx7="http://schemas.microsoft.com/office/drawing/2016/5/13/chartex" xmlns:cx8="http://schemas.microsoft.com/office/drawing/2016/5/14/chartex" xmlns:mc="http://schemas.openxmlformats.org/markup-compatibility/2006" xmlns:m="http://schemas.openxmlformats.org/officeDocument/2006/math" xmlns:aink="http://schemas.microsoft.com/office/drawing/2016/ink" xmlns:am3d="http://schemas.microsoft.com/office/drawing/2017/model3d" xmlns:oel="http://schemas.microsoft.com/office/2019/extlst" xmlns:r="http://schemas.openxmlformats.org/officeDocument/2006/relationships" xmlns:wp14="http://schemas.microsoft.com/office/word/2010/wordprocessingDrawing" xmlns:wp="http://schemas.openxmlformats.org/drawingml/2006/wordprocessingDrawing" xmlns:wpg="http://schemas.microsoft.com/office/word/2010/wordprocessingGroup" xmlns:wpi="http://schemas.microsoft.com/office/word/2010/wordprocessingInk" xmlns:wps="http://schemas.microsoft.com/office/word/2010/wordprocessingShape" xmlns:o="urn:schemas-microsoft-com:office:office" xmlns:v="urn:schemas-microsoft-com:vml" xmlns:w10="urn:schemas-microsoft-com:office:word" xmlns:w="http://schemas.openxmlformats.org/wordprocessingml/2006/main" xmlns:w14="http://schemas.microsoft.com/office/word/2010/wordml" xmlns:w15="http://schemas.microsoft.com/office/word/2012/wordml" xmlns:w16cex="http://schemas.microsoft.com/office/word/2018/wordml/cex" xmlns:w16cid="http://schemas.microsoft.com/office/word/2016/wordml/cid" xmlns:w16="http://schemas.microsoft.com/office/word/2018/wordml" xmlns:w16sdtdh="http://schemas.microsoft.com/office/word/2020/wordml/sdtdatahash" xmlns:w16sdtfl="http://schemas.microsoft.com/office/word/2024/wordml/sdtformatlock" xmlns:w16se="http://schemas.microsoft.com/office/word/2015/wordml/symex" xmlns:w16du="http://schemas.microsoft.com/office/word/2023/wordml/word16du" xmlns:wne="http://schemas.microsoft.com/office/word/2006/wordml" mc:Ignorable="w14 w15 w16se w16cid w16 w16cex w16sdtdh w16sdtfl w16du wp14">
   <w:footnote w:type="separator" w:id="-1">
     <w:p>
       <w:r>
@@ -410,7 +407,7 @@
 </file>
 
 <file path=word/numbering.xml><?xml version="1.0" encoding="utf-8"?>
-<w:numbering xmlns:wpc="http://schemas.microsoft.com/office/word/2010/wordprocessingCanvas" xmlns:cx="http://schemas.microsoft.com/office/drawing/2014/chartex" xmlns:cx1="http://schemas.microsoft.com/office/drawing/2015/9/8/chartex" xmlns:cx2="http://schemas.microsoft.com/office/drawing/2015/10/21/chartex" xmlns:cx3="http://schemas.microsoft.com/office/drawing/2016/5/9/chartex" xmlns:cx4="http://schemas.microsoft.com/office/drawing/2016/5/10/chartex" xmlns:cx5="http://schemas.microsoft.com/office/drawing/2016/5/11/chartex" xmlns:cx6="http://schemas.microsoft.com/office/drawing/2016/5/12/chartex" xmlns:cx7="http://schemas.microsoft.com/office/drawing/2016/5/13/chartex" xmlns:cx8="http://schemas.microsoft.com/office/drawing/2016/5/14/chartex" xmlns:mc="http://schemas.openxmlformats.org/markup-compatibility/2006" xmlns:aink="http://schemas.microsoft.com/office/drawing/2016/ink" xmlns:am3d="http://schemas.microsoft.com/office/drawing/2017/model3d" xmlns:o="urn:schemas-microsoft-com:office:office" xmlns:oel="http://schemas.microsoft.com/office/2019/extlst" xmlns:r="http://schemas.openxmlformats.org/officeDocument/2006/relationships" xmlns:m="http://schemas.openxmlformats.org/officeDocument/2006/math" xmlns:v="urn:schemas-microsoft-com:vml" xmlns:wp14="http://schemas.microsoft.com/office/word/2010/wordprocessingDrawing" xmlns:wp="http://schemas.openxmlformats.org/drawingml/2006/wordprocessingDrawing" xmlns:w10="urn:schemas-microsoft-com:office:word" xmlns:w="http://schemas.openxmlformats.org/wordprocessingml/2006/main" xmlns:w14="http://schemas.microsoft.com/office/word/2010/wordml" xmlns:w15="http://schemas.microsoft.com/office/word/2012/wordml" xmlns:w16cex="http://schemas.microsoft.com/office/word/2018/wordml/cex" xmlns:w16cid="http://schemas.microsoft.com/office/word/2016/wordml/cid" xmlns:w16="http://schemas.microsoft.com/office/word/2018/wordml" xmlns:w16du="http://schemas.microsoft.com/office/word/2023/wordml/word16du" xmlns:w16sdtdh="http://schemas.microsoft.com/office/word/2020/wordml/sdtdatahash" xmlns:w16sdtfl="http://schemas.microsoft.com/office/word/2024/wordml/sdtformatlock" xmlns:w16se="http://schemas.microsoft.com/office/word/2015/wordml/symex" xmlns:wpg="http://schemas.microsoft.com/office/word/2010/wordprocessingGroup" xmlns:wpi="http://schemas.microsoft.com/office/word/2010/wordprocessingInk" xmlns:wne="http://schemas.microsoft.com/office/word/2006/wordml" xmlns:wps="http://schemas.microsoft.com/office/word/2010/wordprocessingShape" mc:Ignorable="w14 w15 w16se w16cid w16 w16cex w16sdtdh w16sdtfl w16du wp14">
+<w:numbering xmlns:wpc="http://schemas.microsoft.com/office/word/2010/wordprocessingCanvas" xmlns:cx="http://schemas.microsoft.com/office/drawing/2014/chartex" xmlns:cx1="http://schemas.microsoft.com/office/drawing/2015/9/8/chartex" xmlns:cx2="http://schemas.microsoft.com/office/drawing/2015/10/21/chartex" xmlns:cx3="http://schemas.microsoft.com/office/drawing/2016/5/9/chartex" xmlns:cx4="http://schemas.microsoft.com/office/drawing/2016/5/10/chartex" xmlns:cx5="http://schemas.microsoft.com/office/drawing/2016/5/11/chartex" xmlns:cx6="http://schemas.microsoft.com/office/drawing/2016/5/12/chartex" xmlns:cx7="http://schemas.microsoft.com/office/drawing/2016/5/13/chartex" xmlns:cx8="http://schemas.microsoft.com/office/drawing/2016/5/14/chartex" xmlns:mc="http://schemas.openxmlformats.org/markup-compatibility/2006" xmlns:m="http://schemas.openxmlformats.org/officeDocument/2006/math" xmlns:aink="http://schemas.microsoft.com/office/drawing/2016/ink" xmlns:am3d="http://schemas.microsoft.com/office/drawing/2017/model3d" xmlns:oel="http://schemas.microsoft.com/office/2019/extlst" xmlns:r="http://schemas.openxmlformats.org/officeDocument/2006/relationships" xmlns:wp14="http://schemas.microsoft.com/office/word/2010/wordprocessingDrawing" xmlns:wp="http://schemas.openxmlformats.org/drawingml/2006/wordprocessingDrawing" xmlns:wpg="http://schemas.microsoft.com/office/word/2010/wordprocessingGroup" xmlns:wpi="http://schemas.microsoft.com/office/word/2010/wordprocessingInk" xmlns:wps="http://schemas.microsoft.com/office/word/2010/wordprocessingShape" xmlns:o="urn:schemas-microsoft-com:office:office" xmlns:v="urn:schemas-microsoft-com:vml" xmlns:w10="urn:schemas-microsoft-com:office:word" xmlns:w="http://schemas.openxmlformats.org/wordprocessingml/2006/main" xmlns:w14="http://schemas.microsoft.com/office/word/2010/wordml" xmlns:w15="http://schemas.microsoft.com/office/word/2012/wordml" xmlns:w16cex="http://schemas.microsoft.com/office/word/2018/wordml/cex" xmlns:w16cid="http://schemas.microsoft.com/office/word/2016/wordml/cid" xmlns:w16="http://schemas.microsoft.com/office/word/2018/wordml" xmlns:w16sdtdh="http://schemas.microsoft.com/office/word/2020/wordml/sdtdatahash" xmlns:w16sdtfl="http://schemas.microsoft.com/office/word/2024/wordml/sdtformatlock" xmlns:w16se="http://schemas.microsoft.com/office/word/2015/wordml/symex" xmlns:w16du="http://schemas.microsoft.com/office/word/2023/wordml/word16du" xmlns:wne="http://schemas.microsoft.com/office/word/2006/wordml" mc:Ignorable="w14 w15 w16se w16cid w16 w16cex w16sdtdh w16sdtfl w16du wp14">
   <w:abstractNum w:abstractNumId="0" w15:restartNumberingAfterBreak="0">
     <w:nsid w:val="170CD2DE"/>
     <w:multiLevelType w:val="multilevel"/>
@@ -522,7 +519,7 @@
 </file>
 
 <file path=word/styles.xml><?xml version="1.0" encoding="utf-8"?>
-<w:styles xmlns:mc="http://schemas.openxmlformats.org/markup-compatibility/2006" xmlns:w="http://schemas.openxmlformats.org/wordprocessingml/2006/main" mc:Ignorable="w14 w15 w16se w16cid w16 w16cex w16sdtdh w16sdtfl w16du">
+<w:styles xmlns:mc="http://schemas.openxmlformats.org/markup-compatibility/2006" xmlns:r="http://schemas.openxmlformats.org/officeDocument/2006/relationships" xmlns:w="http://schemas.openxmlformats.org/wordprocessingml/2006/main" xmlns:w14="http://schemas.microsoft.com/office/word/2010/wordml" xmlns:w15="http://schemas.microsoft.com/office/word/2012/wordml" xmlns:w16cex="http://schemas.microsoft.com/office/word/2018/wordml/cex" xmlns:w16cid="http://schemas.microsoft.com/office/word/2016/wordml/cid" xmlns:w16="http://schemas.microsoft.com/office/word/2018/wordml" xmlns:w16sdtdh="http://schemas.microsoft.com/office/word/2020/wordml/sdtdatahash" xmlns:w16sdtfl="http://schemas.microsoft.com/office/word/2024/wordml/sdtformatlock" xmlns:w16se="http://schemas.microsoft.com/office/word/2015/wordml/symex" xmlns:w16du="http://schemas.microsoft.com/office/word/2023/wordml/word16du" mc:Ignorable="w14 w15 w16se w16cid w16 w16cex w16sdtdh w16sdtfl w16du">
   <w:docDefaults>
     <w:rPrDefault>
       <w:rPr>
@@ -869,7 +866,7 @@
     <w:semiHidden/>
     <w:unhideWhenUsed/>
     <w:qFormat/>
-    <w:rsid w:val="00A10FD9"/>
+    <w:rsid w:val="00583789"/>
     <w:pPr>
       <w:keepNext/>
       <w:keepLines/>
@@ -880,7 +877,7 @@
       <w:rFonts w:eastAsiaTheme="majorEastAsia" w:cstheme="majorBidi"/>
       <w:i/>
       <w:iCs/>
-      <w:color w:val="0F4761" w:themeColor="accent1" w:themeShade="BF"/>
+      <w:color w:val="000000" w:themeColor="text1"/>
     </w:rPr>
   </w:style>
   <w:style w:type="paragraph" w:styleId="Heading5">
@@ -892,7 +889,7 @@
     <w:semiHidden/>
     <w:unhideWhenUsed/>
     <w:qFormat/>
-    <w:rsid w:val="00A10FD9"/>
+    <w:rsid w:val="00583789"/>
     <w:pPr>
       <w:keepNext/>
       <w:keepLines/>
@@ -901,7 +898,7 @@
     </w:pPr>
     <w:rPr>
       <w:rFonts w:eastAsiaTheme="majorEastAsia" w:cstheme="majorBidi"/>
-      <w:color w:val="0F4761" w:themeColor="accent1" w:themeShade="BF"/>
+      <w:color w:val="000000" w:themeColor="text1"/>
     </w:rPr>
   </w:style>
   <w:style w:type="paragraph" w:styleId="Heading6">
@@ -1219,12 +1216,12 @@
     <w:link w:val="Heading4"/>
     <w:uiPriority w:val="9"/>
     <w:semiHidden/>
-    <w:rsid w:val="00A10FD9"/>
-    <w:rPr>
-      <w:rFonts w:eastAsiaTheme="majorEastAsia" w:cstheme="majorBidi"/>
+    <w:rsid w:val="00583789"/>
+    <w:rPr>
+      <w:rFonts w:ascii="Arial" w:eastAsiaTheme="majorEastAsia" w:hAnsi="Arial" w:cstheme="majorBidi"/>
       <w:i/>
       <w:iCs/>
-      <w:color w:val="0F4761" w:themeColor="accent1" w:themeShade="BF"/>
+      <w:color w:val="000000" w:themeColor="text1"/>
     </w:rPr>
   </w:style>
   <w:style w:type="character" w:customStyle="1" w:styleId="Heading5Char">
@@ -1233,10 +1230,10 @@
     <w:link w:val="Heading5"/>
     <w:uiPriority w:val="9"/>
     <w:semiHidden/>
-    <w:rsid w:val="00A10FD9"/>
-    <w:rPr>
-      <w:rFonts w:eastAsiaTheme="majorEastAsia" w:cstheme="majorBidi"/>
-      <w:color w:val="0F4761" w:themeColor="accent1" w:themeShade="BF"/>
+    <w:rsid w:val="00583789"/>
+    <w:rPr>
+      <w:rFonts w:ascii="Arial" w:eastAsiaTheme="majorEastAsia" w:hAnsi="Arial" w:cstheme="majorBidi"/>
+      <w:color w:val="000000" w:themeColor="text1"/>
     </w:rPr>
   </w:style>
   <w:style w:type="character" w:customStyle="1" w:styleId="Heading6Char">

</xml_diff>